<commit_message>
Add user personas section and store manager goals
</commit_message>
<xml_diff>
--- a/docs/Project-planning.docx
+++ b/docs/Project-planning.docx
@@ -229,6 +229,7 @@
           <w:rFonts w:ascii="Calibri" w:hAnsi="Calibri" w:cs="Calibri"/>
           <w:sz w:val="24"/>
           <w:szCs w:val="24"/>
+          <w:lang w:val="ru-RU"/>
         </w:rPr>
       </w:pPr>
     </w:p>
@@ -290,6 +291,7 @@
           <w:rFonts w:ascii="Calibri" w:hAnsi="Calibri" w:cs="Calibri"/>
           <w:sz w:val="24"/>
           <w:szCs w:val="24"/>
+          <w:lang w:val="ru-RU"/>
         </w:rPr>
       </w:pPr>
       <w:r>
@@ -299,6 +301,243 @@
           <w:szCs w:val="24"/>
         </w:rPr>
         <w:t>The platform demonstrates practical server-side development skills including CRUD operations, database management, authentication, validation, and MVC architecture.</w:t>
+      </w:r>
+    </w:p>
+    <w:p>
+      <w:pPr>
+        <w:rPr>
+          <w:rFonts w:ascii="Calibri" w:hAnsi="Calibri" w:cs="Calibri"/>
+          <w:sz w:val="24"/>
+          <w:szCs w:val="24"/>
+          <w:lang w:val="ru-RU"/>
+        </w:rPr>
+      </w:pPr>
+    </w:p>
+    <w:p>
+      <w:pPr>
+        <w:rPr>
+          <w:rFonts w:ascii="Calibri" w:hAnsi="Calibri" w:cs="Calibri"/>
+          <w:b/>
+          <w:bCs/>
+          <w:sz w:val="24"/>
+          <w:szCs w:val="24"/>
+        </w:rPr>
+      </w:pPr>
+      <w:r>
+        <w:rPr>
+          <w:rFonts w:ascii="Calibri" w:hAnsi="Calibri" w:cs="Calibri"/>
+          <w:b/>
+          <w:bCs/>
+          <w:sz w:val="24"/>
+          <w:szCs w:val="24"/>
+        </w:rPr>
+        <w:t>2. User Personas</w:t>
+      </w:r>
+    </w:p>
+    <w:p>
+      <w:pPr>
+        <w:rPr>
+          <w:rFonts w:ascii="Calibri" w:hAnsi="Calibri" w:cs="Calibri"/>
+          <w:sz w:val="24"/>
+          <w:szCs w:val="24"/>
+        </w:rPr>
+      </w:pPr>
+    </w:p>
+    <w:p>
+      <w:pPr>
+        <w:rPr>
+          <w:rFonts w:ascii="Calibri" w:hAnsi="Calibri" w:cs="Calibri"/>
+          <w:sz w:val="24"/>
+          <w:szCs w:val="24"/>
+        </w:rPr>
+      </w:pPr>
+      <w:r>
+        <w:rPr>
+          <w:rFonts w:ascii="Calibri" w:hAnsi="Calibri" w:cs="Calibri"/>
+          <w:sz w:val="24"/>
+          <w:szCs w:val="24"/>
+        </w:rPr>
+        <w:t>Persona 1: Store Manager</w:t>
+      </w:r>
+    </w:p>
+    <w:p>
+      <w:pPr>
+        <w:rPr>
+          <w:rFonts w:ascii="Calibri" w:hAnsi="Calibri" w:cs="Calibri"/>
+          <w:sz w:val="24"/>
+          <w:szCs w:val="24"/>
+        </w:rPr>
+      </w:pPr>
+    </w:p>
+    <w:p>
+      <w:pPr>
+        <w:rPr>
+          <w:rFonts w:ascii="Calibri" w:hAnsi="Calibri" w:cs="Calibri"/>
+          <w:sz w:val="24"/>
+          <w:szCs w:val="24"/>
+        </w:rPr>
+      </w:pPr>
+      <w:r>
+        <w:rPr>
+          <w:rFonts w:ascii="Calibri" w:hAnsi="Calibri" w:cs="Calibri"/>
+          <w:sz w:val="24"/>
+          <w:szCs w:val="24"/>
+        </w:rPr>
+        <w:t xml:space="preserve">Name: Alex </w:t>
+      </w:r>
+      <w:r>
+        <w:rPr>
+          <w:rFonts w:ascii="Calibri" w:hAnsi="Calibri" w:cs="Calibri"/>
+          <w:sz w:val="24"/>
+          <w:szCs w:val="24"/>
+        </w:rPr>
+        <w:t>O'Brien</w:t>
+      </w:r>
+    </w:p>
+    <w:p>
+      <w:pPr>
+        <w:rPr>
+          <w:rFonts w:ascii="Calibri" w:hAnsi="Calibri" w:cs="Calibri"/>
+          <w:sz w:val="24"/>
+          <w:szCs w:val="24"/>
+        </w:rPr>
+      </w:pPr>
+      <w:r>
+        <w:rPr>
+          <w:rFonts w:ascii="Calibri" w:hAnsi="Calibri" w:cs="Calibri"/>
+          <w:sz w:val="24"/>
+          <w:szCs w:val="24"/>
+        </w:rPr>
+        <w:t>Age: 35</w:t>
+      </w:r>
+    </w:p>
+    <w:p>
+      <w:pPr>
+        <w:rPr>
+          <w:rFonts w:ascii="Calibri" w:hAnsi="Calibri" w:cs="Calibri"/>
+          <w:sz w:val="24"/>
+          <w:szCs w:val="24"/>
+        </w:rPr>
+      </w:pPr>
+      <w:r>
+        <w:rPr>
+          <w:rFonts w:ascii="Calibri" w:hAnsi="Calibri" w:cs="Calibri"/>
+          <w:sz w:val="24"/>
+          <w:szCs w:val="24"/>
+        </w:rPr>
+        <w:t>Role: Supermarket Manager</w:t>
+      </w:r>
+    </w:p>
+    <w:p>
+      <w:pPr>
+        <w:rPr>
+          <w:rFonts w:ascii="Calibri" w:hAnsi="Calibri" w:cs="Calibri"/>
+          <w:sz w:val="24"/>
+          <w:szCs w:val="24"/>
+        </w:rPr>
+      </w:pPr>
+    </w:p>
+    <w:p>
+      <w:pPr>
+        <w:rPr>
+          <w:rFonts w:ascii="Calibri" w:hAnsi="Calibri" w:cs="Calibri"/>
+          <w:sz w:val="24"/>
+          <w:szCs w:val="24"/>
+        </w:rPr>
+      </w:pPr>
+      <w:r>
+        <w:rPr>
+          <w:rFonts w:ascii="Calibri" w:hAnsi="Calibri" w:cs="Calibri"/>
+          <w:sz w:val="24"/>
+          <w:szCs w:val="24"/>
+        </w:rPr>
+        <w:t>Goals:</w:t>
+      </w:r>
+    </w:p>
+    <w:p>
+      <w:pPr>
+        <w:rPr>
+          <w:rFonts w:ascii="Calibri" w:hAnsi="Calibri" w:cs="Calibri"/>
+          <w:sz w:val="24"/>
+          <w:szCs w:val="24"/>
+        </w:rPr>
+      </w:pPr>
+      <w:r>
+        <w:rPr>
+          <w:rFonts w:ascii="Calibri" w:hAnsi="Calibri" w:cs="Calibri"/>
+          <w:sz w:val="24"/>
+          <w:szCs w:val="24"/>
+        </w:rPr>
+        <w:t xml:space="preserve">- Manage the supermarket product </w:t>
+      </w:r>
+      <w:proofErr w:type="spellStart"/>
+      <w:r>
+        <w:rPr>
+          <w:rFonts w:ascii="Calibri" w:hAnsi="Calibri" w:cs="Calibri"/>
+          <w:sz w:val="24"/>
+          <w:szCs w:val="24"/>
+        </w:rPr>
+        <w:t>catalog</w:t>
+      </w:r>
+      <w:proofErr w:type="spellEnd"/>
+      <w:r>
+        <w:rPr>
+          <w:rFonts w:ascii="Calibri" w:hAnsi="Calibri" w:cs="Calibri"/>
+          <w:sz w:val="24"/>
+          <w:szCs w:val="24"/>
+        </w:rPr>
+        <w:t xml:space="preserve"> efficiently.</w:t>
+      </w:r>
+    </w:p>
+    <w:p>
+      <w:pPr>
+        <w:rPr>
+          <w:rFonts w:ascii="Calibri" w:hAnsi="Calibri" w:cs="Calibri"/>
+          <w:sz w:val="24"/>
+          <w:szCs w:val="24"/>
+        </w:rPr>
+      </w:pPr>
+      <w:r>
+        <w:rPr>
+          <w:rFonts w:ascii="Calibri" w:hAnsi="Calibri" w:cs="Calibri"/>
+          <w:sz w:val="24"/>
+          <w:szCs w:val="24"/>
+        </w:rPr>
+        <w:t>- Add new products when new stock arrives.</w:t>
+      </w:r>
+    </w:p>
+    <w:p>
+      <w:pPr>
+        <w:rPr>
+          <w:rFonts w:ascii="Calibri" w:hAnsi="Calibri" w:cs="Calibri"/>
+          <w:sz w:val="24"/>
+          <w:szCs w:val="24"/>
+        </w:rPr>
+      </w:pPr>
+      <w:r>
+        <w:rPr>
+          <w:rFonts w:ascii="Calibri" w:hAnsi="Calibri" w:cs="Calibri"/>
+          <w:sz w:val="24"/>
+          <w:szCs w:val="24"/>
+        </w:rPr>
+        <w:t>- Update product prices and inventory levels.</w:t>
+      </w:r>
+    </w:p>
+    <w:p>
+      <w:pPr>
+        <w:rPr>
+          <w:rFonts w:ascii="Calibri" w:hAnsi="Calibri" w:cs="Calibri"/>
+          <w:sz w:val="24"/>
+          <w:szCs w:val="24"/>
+        </w:rPr>
+      </w:pPr>
+      <w:r>
+        <w:rPr>
+          <w:rFonts w:ascii="Calibri" w:hAnsi="Calibri" w:cs="Calibri"/>
+          <w:sz w:val="24"/>
+          <w:szCs w:val="24"/>
+        </w:rPr>
+        <w:t>- Remove products that are no longer available.</w:t>
       </w:r>
     </w:p>
     <w:sectPr>
@@ -921,7 +1160,6 @@
   <w:style w:type="character" w:default="1" w:styleId="DefaultParagraphFont">
     <w:name w:val="Default Paragraph Font"/>
     <w:uiPriority w:val="1"/>
-    <w:semiHidden/>
     <w:unhideWhenUsed/>
   </w:style>
   <w:style w:type="table" w:default="1" w:styleId="TableNormal">

</xml_diff>

<commit_message>
Add store manager persona needs and behaviours
</commit_message>
<xml_diff>
--- a/docs/Project-planning.docx
+++ b/docs/Project-planning.docx
@@ -347,13 +347,17 @@
       <w:pPr>
         <w:rPr>
           <w:rFonts w:ascii="Calibri" w:hAnsi="Calibri" w:cs="Calibri"/>
-          <w:sz w:val="24"/>
-          <w:szCs w:val="24"/>
-        </w:rPr>
-      </w:pPr>
-      <w:r>
-        <w:rPr>
-          <w:rFonts w:ascii="Calibri" w:hAnsi="Calibri" w:cs="Calibri"/>
+          <w:b/>
+          <w:bCs/>
+          <w:sz w:val="24"/>
+          <w:szCs w:val="24"/>
+        </w:rPr>
+      </w:pPr>
+      <w:r>
+        <w:rPr>
+          <w:rFonts w:ascii="Calibri" w:hAnsi="Calibri" w:cs="Calibri"/>
+          <w:b/>
+          <w:bCs/>
           <w:sz w:val="24"/>
           <w:szCs w:val="24"/>
         </w:rPr>
@@ -417,6 +421,7 @@
           <w:rFonts w:ascii="Calibri" w:hAnsi="Calibri" w:cs="Calibri"/>
           <w:sz w:val="24"/>
           <w:szCs w:val="24"/>
+          <w:lang w:val="ru-RU"/>
         </w:rPr>
       </w:pPr>
       <w:r>
@@ -432,22 +437,17 @@
       <w:pPr>
         <w:rPr>
           <w:rFonts w:ascii="Calibri" w:hAnsi="Calibri" w:cs="Calibri"/>
-          <w:sz w:val="24"/>
-          <w:szCs w:val="24"/>
-        </w:rPr>
-      </w:pPr>
-    </w:p>
-    <w:p>
-      <w:pPr>
-        <w:rPr>
-          <w:rFonts w:ascii="Calibri" w:hAnsi="Calibri" w:cs="Calibri"/>
-          <w:sz w:val="24"/>
-          <w:szCs w:val="24"/>
-        </w:rPr>
-      </w:pPr>
-      <w:r>
-        <w:rPr>
-          <w:rFonts w:ascii="Calibri" w:hAnsi="Calibri" w:cs="Calibri"/>
+          <w:b/>
+          <w:bCs/>
+          <w:sz w:val="24"/>
+          <w:szCs w:val="24"/>
+        </w:rPr>
+      </w:pPr>
+      <w:r>
+        <w:rPr>
+          <w:rFonts w:ascii="Calibri" w:hAnsi="Calibri" w:cs="Calibri"/>
+          <w:b/>
+          <w:bCs/>
           <w:sz w:val="24"/>
           <w:szCs w:val="24"/>
         </w:rPr>
@@ -529,6 +529,7 @@
           <w:rFonts w:ascii="Calibri" w:hAnsi="Calibri" w:cs="Calibri"/>
           <w:sz w:val="24"/>
           <w:szCs w:val="24"/>
+          <w:lang w:val="ru-RU"/>
         </w:rPr>
       </w:pPr>
       <w:r>
@@ -538,6 +539,151 @@
           <w:szCs w:val="24"/>
         </w:rPr>
         <w:t>- Remove products that are no longer available.</w:t>
+      </w:r>
+    </w:p>
+    <w:p>
+      <w:pPr>
+        <w:rPr>
+          <w:rFonts w:ascii="Calibri" w:hAnsi="Calibri" w:cs="Calibri"/>
+          <w:b/>
+          <w:bCs/>
+          <w:sz w:val="24"/>
+          <w:szCs w:val="24"/>
+        </w:rPr>
+      </w:pPr>
+      <w:r>
+        <w:rPr>
+          <w:rFonts w:ascii="Calibri" w:hAnsi="Calibri" w:cs="Calibri"/>
+          <w:b/>
+          <w:bCs/>
+          <w:sz w:val="24"/>
+          <w:szCs w:val="24"/>
+        </w:rPr>
+        <w:t>Needs:</w:t>
+      </w:r>
+    </w:p>
+    <w:p>
+      <w:pPr>
+        <w:rPr>
+          <w:rFonts w:ascii="Calibri" w:hAnsi="Calibri" w:cs="Calibri"/>
+          <w:sz w:val="24"/>
+          <w:szCs w:val="24"/>
+        </w:rPr>
+      </w:pPr>
+      <w:r>
+        <w:rPr>
+          <w:rFonts w:ascii="Calibri" w:hAnsi="Calibri" w:cs="Calibri"/>
+          <w:sz w:val="24"/>
+          <w:szCs w:val="24"/>
+        </w:rPr>
+        <w:t>- A clear dashboard to manage products and categories.</w:t>
+      </w:r>
+    </w:p>
+    <w:p>
+      <w:pPr>
+        <w:rPr>
+          <w:rFonts w:ascii="Calibri" w:hAnsi="Calibri" w:cs="Calibri"/>
+          <w:sz w:val="24"/>
+          <w:szCs w:val="24"/>
+        </w:rPr>
+      </w:pPr>
+      <w:r>
+        <w:rPr>
+          <w:rFonts w:ascii="Calibri" w:hAnsi="Calibri" w:cs="Calibri"/>
+          <w:sz w:val="24"/>
+          <w:szCs w:val="24"/>
+        </w:rPr>
+        <w:t>- Easy forms for adding and editing product information.</w:t>
+      </w:r>
+    </w:p>
+    <w:p>
+      <w:pPr>
+        <w:rPr>
+          <w:rFonts w:ascii="Calibri" w:hAnsi="Calibri" w:cs="Calibri"/>
+          <w:sz w:val="24"/>
+          <w:szCs w:val="24"/>
+          <w:lang w:val="ru-RU"/>
+        </w:rPr>
+      </w:pPr>
+      <w:r>
+        <w:rPr>
+          <w:rFonts w:ascii="Calibri" w:hAnsi="Calibri" w:cs="Calibri"/>
+          <w:sz w:val="24"/>
+          <w:szCs w:val="24"/>
+        </w:rPr>
+        <w:t>- Quick access to stock information.</w:t>
+      </w:r>
+    </w:p>
+    <w:p>
+      <w:pPr>
+        <w:rPr>
+          <w:rFonts w:ascii="Calibri" w:hAnsi="Calibri" w:cs="Calibri"/>
+          <w:b/>
+          <w:bCs/>
+          <w:sz w:val="24"/>
+          <w:szCs w:val="24"/>
+        </w:rPr>
+      </w:pPr>
+      <w:r>
+        <w:rPr>
+          <w:rFonts w:ascii="Calibri" w:hAnsi="Calibri" w:cs="Calibri"/>
+          <w:b/>
+          <w:bCs/>
+          <w:sz w:val="24"/>
+          <w:szCs w:val="24"/>
+        </w:rPr>
+        <w:t>Behaviours:</w:t>
+      </w:r>
+    </w:p>
+    <w:p>
+      <w:pPr>
+        <w:rPr>
+          <w:rFonts w:ascii="Calibri" w:hAnsi="Calibri" w:cs="Calibri"/>
+          <w:sz w:val="24"/>
+          <w:szCs w:val="24"/>
+        </w:rPr>
+      </w:pPr>
+      <w:r>
+        <w:rPr>
+          <w:rFonts w:ascii="Calibri" w:hAnsi="Calibri" w:cs="Calibri"/>
+          <w:sz w:val="24"/>
+          <w:szCs w:val="24"/>
+        </w:rPr>
+        <w:t>- Logs into the system daily to monitor products.</w:t>
+      </w:r>
+    </w:p>
+    <w:p>
+      <w:pPr>
+        <w:rPr>
+          <w:rFonts w:ascii="Calibri" w:hAnsi="Calibri" w:cs="Calibri"/>
+          <w:sz w:val="24"/>
+          <w:szCs w:val="24"/>
+        </w:rPr>
+      </w:pPr>
+      <w:r>
+        <w:rPr>
+          <w:rFonts w:ascii="Calibri" w:hAnsi="Calibri" w:cs="Calibri"/>
+          <w:sz w:val="24"/>
+          <w:szCs w:val="24"/>
+        </w:rPr>
+        <w:t>- Updates stock levels and product details regularly.</w:t>
+      </w:r>
+    </w:p>
+    <w:p>
+      <w:pPr>
+        <w:rPr>
+          <w:rFonts w:ascii="Calibri" w:hAnsi="Calibri" w:cs="Calibri"/>
+          <w:sz w:val="24"/>
+          <w:szCs w:val="24"/>
+        </w:rPr>
+      </w:pPr>
+      <w:r>
+        <w:rPr>
+          <w:rFonts w:ascii="Calibri" w:hAnsi="Calibri" w:cs="Calibri"/>
+          <w:sz w:val="24"/>
+          <w:szCs w:val="24"/>
+        </w:rPr>
+        <w:t>- Reviews product availability to ensure accurate inventory data.</w:t>
       </w:r>
     </w:p>
     <w:sectPr>

</xml_diff>

<commit_message>
Add store manager persona frustrations
</commit_message>
<xml_diff>
--- a/docs/Project-planning.docx
+++ b/docs/Project-planning.docx
@@ -675,6 +675,7 @@
           <w:rFonts w:ascii="Calibri" w:hAnsi="Calibri" w:cs="Calibri"/>
           <w:sz w:val="24"/>
           <w:szCs w:val="24"/>
+          <w:lang w:val="ru-RU"/>
         </w:rPr>
       </w:pPr>
       <w:r>
@@ -684,6 +685,78 @@
           <w:szCs w:val="24"/>
         </w:rPr>
         <w:t>- Reviews product availability to ensure accurate inventory data.</w:t>
+      </w:r>
+    </w:p>
+    <w:p>
+      <w:pPr>
+        <w:rPr>
+          <w:rFonts w:ascii="Calibri" w:hAnsi="Calibri" w:cs="Calibri"/>
+          <w:b/>
+          <w:bCs/>
+          <w:sz w:val="24"/>
+          <w:szCs w:val="24"/>
+        </w:rPr>
+      </w:pPr>
+      <w:r>
+        <w:rPr>
+          <w:rFonts w:ascii="Calibri" w:hAnsi="Calibri" w:cs="Calibri"/>
+          <w:b/>
+          <w:bCs/>
+          <w:sz w:val="24"/>
+          <w:szCs w:val="24"/>
+        </w:rPr>
+        <w:t>Frustrations:</w:t>
+      </w:r>
+    </w:p>
+    <w:p>
+      <w:pPr>
+        <w:rPr>
+          <w:rFonts w:ascii="Calibri" w:hAnsi="Calibri" w:cs="Calibri"/>
+          <w:sz w:val="24"/>
+          <w:szCs w:val="24"/>
+        </w:rPr>
+      </w:pPr>
+      <w:r>
+        <w:rPr>
+          <w:rFonts w:ascii="Calibri" w:hAnsi="Calibri" w:cs="Calibri"/>
+          <w:sz w:val="24"/>
+          <w:szCs w:val="24"/>
+        </w:rPr>
+        <w:t>- Manual inventory management is time-consuming.</w:t>
+      </w:r>
+    </w:p>
+    <w:p>
+      <w:pPr>
+        <w:rPr>
+          <w:rFonts w:ascii="Calibri" w:hAnsi="Calibri" w:cs="Calibri"/>
+          <w:sz w:val="24"/>
+          <w:szCs w:val="24"/>
+        </w:rPr>
+      </w:pPr>
+      <w:r>
+        <w:rPr>
+          <w:rFonts w:ascii="Calibri" w:hAnsi="Calibri" w:cs="Calibri"/>
+          <w:sz w:val="24"/>
+          <w:szCs w:val="24"/>
+        </w:rPr>
+        <w:t>- Outdated product information can confuse customers.</w:t>
+      </w:r>
+    </w:p>
+    <w:p>
+      <w:pPr>
+        <w:rPr>
+          <w:rFonts w:ascii="Calibri" w:hAnsi="Calibri" w:cs="Calibri"/>
+          <w:sz w:val="24"/>
+          <w:szCs w:val="24"/>
+        </w:rPr>
+      </w:pPr>
+      <w:r>
+        <w:rPr>
+          <w:rFonts w:ascii="Calibri" w:hAnsi="Calibri" w:cs="Calibri"/>
+          <w:sz w:val="24"/>
+          <w:szCs w:val="24"/>
+        </w:rPr>
+        <w:t>- Lack of a centralized system for product management.</w:t>
       </w:r>
     </w:p>
     <w:sectPr>

</xml_diff>

<commit_message>
Add customer persona goals and needs
</commit_message>
<xml_diff>
--- a/docs/Project-planning.docx
+++ b/docs/Project-planning.docx
@@ -748,6 +748,7 @@
           <w:rFonts w:ascii="Calibri" w:hAnsi="Calibri" w:cs="Calibri"/>
           <w:sz w:val="24"/>
           <w:szCs w:val="24"/>
+          <w:lang w:val="ru-RU"/>
         </w:rPr>
       </w:pPr>
       <w:r>
@@ -757,6 +758,260 @@
           <w:szCs w:val="24"/>
         </w:rPr>
         <w:t>- Lack of a centralized system for product management.</w:t>
+      </w:r>
+    </w:p>
+    <w:p>
+      <w:pPr>
+        <w:rPr>
+          <w:rFonts w:ascii="Calibri" w:hAnsi="Calibri" w:cs="Calibri"/>
+          <w:sz w:val="24"/>
+          <w:szCs w:val="24"/>
+          <w:lang w:val="ru-RU"/>
+        </w:rPr>
+      </w:pPr>
+    </w:p>
+    <w:p>
+      <w:pPr>
+        <w:rPr>
+          <w:rFonts w:ascii="Calibri" w:hAnsi="Calibri" w:cs="Calibri"/>
+          <w:b/>
+          <w:bCs/>
+          <w:sz w:val="24"/>
+          <w:szCs w:val="24"/>
+        </w:rPr>
+      </w:pPr>
+      <w:r>
+        <w:rPr>
+          <w:rFonts w:ascii="Calibri" w:hAnsi="Calibri" w:cs="Calibri"/>
+          <w:b/>
+          <w:bCs/>
+          <w:sz w:val="24"/>
+          <w:szCs w:val="24"/>
+        </w:rPr>
+        <w:t>Persona 2: Customer</w:t>
+      </w:r>
+    </w:p>
+    <w:p>
+      <w:pPr>
+        <w:rPr>
+          <w:rFonts w:ascii="Calibri" w:hAnsi="Calibri" w:cs="Calibri"/>
+          <w:sz w:val="24"/>
+          <w:szCs w:val="24"/>
+        </w:rPr>
+      </w:pPr>
+    </w:p>
+    <w:p>
+      <w:pPr>
+        <w:rPr>
+          <w:rFonts w:ascii="Calibri" w:hAnsi="Calibri" w:cs="Calibri"/>
+          <w:sz w:val="24"/>
+          <w:szCs w:val="24"/>
+        </w:rPr>
+      </w:pPr>
+      <w:r>
+        <w:rPr>
+          <w:rFonts w:ascii="Calibri" w:hAnsi="Calibri" w:cs="Calibri"/>
+          <w:sz w:val="24"/>
+          <w:szCs w:val="24"/>
+        </w:rPr>
+        <w:t>Name: Emma O'Sullivan</w:t>
+      </w:r>
+    </w:p>
+    <w:p>
+      <w:pPr>
+        <w:rPr>
+          <w:rFonts w:ascii="Calibri" w:hAnsi="Calibri" w:cs="Calibri"/>
+          <w:sz w:val="24"/>
+          <w:szCs w:val="24"/>
+        </w:rPr>
+      </w:pPr>
+      <w:r>
+        <w:rPr>
+          <w:rFonts w:ascii="Calibri" w:hAnsi="Calibri" w:cs="Calibri"/>
+          <w:sz w:val="24"/>
+          <w:szCs w:val="24"/>
+        </w:rPr>
+        <w:t>Age: 28</w:t>
+      </w:r>
+    </w:p>
+    <w:p>
+      <w:pPr>
+        <w:rPr>
+          <w:rFonts w:ascii="Calibri" w:hAnsi="Calibri" w:cs="Calibri"/>
+          <w:sz w:val="24"/>
+          <w:szCs w:val="24"/>
+        </w:rPr>
+      </w:pPr>
+      <w:r>
+        <w:rPr>
+          <w:rFonts w:ascii="Calibri" w:hAnsi="Calibri" w:cs="Calibri"/>
+          <w:sz w:val="24"/>
+          <w:szCs w:val="24"/>
+        </w:rPr>
+        <w:t>Role: Supermarket Customer</w:t>
+      </w:r>
+    </w:p>
+    <w:p>
+      <w:pPr>
+        <w:rPr>
+          <w:rFonts w:ascii="Calibri" w:hAnsi="Calibri" w:cs="Calibri"/>
+          <w:sz w:val="24"/>
+          <w:szCs w:val="24"/>
+        </w:rPr>
+      </w:pPr>
+    </w:p>
+    <w:p>
+      <w:pPr>
+        <w:rPr>
+          <w:rFonts w:ascii="Calibri" w:hAnsi="Calibri" w:cs="Calibri"/>
+          <w:b/>
+          <w:bCs/>
+          <w:sz w:val="24"/>
+          <w:szCs w:val="24"/>
+        </w:rPr>
+      </w:pPr>
+      <w:r>
+        <w:rPr>
+          <w:rFonts w:ascii="Calibri" w:hAnsi="Calibri" w:cs="Calibri"/>
+          <w:b/>
+          <w:bCs/>
+          <w:sz w:val="24"/>
+          <w:szCs w:val="24"/>
+        </w:rPr>
+        <w:t>Goals:</w:t>
+      </w:r>
+    </w:p>
+    <w:p>
+      <w:pPr>
+        <w:rPr>
+          <w:rFonts w:ascii="Calibri" w:hAnsi="Calibri" w:cs="Calibri"/>
+          <w:sz w:val="24"/>
+          <w:szCs w:val="24"/>
+        </w:rPr>
+      </w:pPr>
+      <w:r>
+        <w:rPr>
+          <w:rFonts w:ascii="Calibri" w:hAnsi="Calibri" w:cs="Calibri"/>
+          <w:sz w:val="24"/>
+          <w:szCs w:val="24"/>
+        </w:rPr>
+        <w:lastRenderedPageBreak/>
+        <w:t>- Browse available supermarket products online.</w:t>
+      </w:r>
+    </w:p>
+    <w:p>
+      <w:pPr>
+        <w:rPr>
+          <w:rFonts w:ascii="Calibri" w:hAnsi="Calibri" w:cs="Calibri"/>
+          <w:sz w:val="24"/>
+          <w:szCs w:val="24"/>
+        </w:rPr>
+      </w:pPr>
+      <w:r>
+        <w:rPr>
+          <w:rFonts w:ascii="Calibri" w:hAnsi="Calibri" w:cs="Calibri"/>
+          <w:sz w:val="24"/>
+          <w:szCs w:val="24"/>
+        </w:rPr>
+        <w:t>- Check prices and product availability before visiting the store.</w:t>
+      </w:r>
+    </w:p>
+    <w:p>
+      <w:pPr>
+        <w:rPr>
+          <w:rFonts w:ascii="Calibri" w:hAnsi="Calibri" w:cs="Calibri"/>
+          <w:sz w:val="24"/>
+          <w:szCs w:val="24"/>
+        </w:rPr>
+      </w:pPr>
+      <w:r>
+        <w:rPr>
+          <w:rFonts w:ascii="Calibri" w:hAnsi="Calibri" w:cs="Calibri"/>
+          <w:sz w:val="24"/>
+          <w:szCs w:val="24"/>
+        </w:rPr>
+        <w:t>- Quickly find products using search or categories.</w:t>
+      </w:r>
+    </w:p>
+    <w:p>
+      <w:pPr>
+        <w:rPr>
+          <w:rFonts w:ascii="Calibri" w:hAnsi="Calibri" w:cs="Calibri"/>
+          <w:sz w:val="24"/>
+          <w:szCs w:val="24"/>
+        </w:rPr>
+      </w:pPr>
+    </w:p>
+    <w:p>
+      <w:pPr>
+        <w:rPr>
+          <w:rFonts w:ascii="Calibri" w:hAnsi="Calibri" w:cs="Calibri"/>
+          <w:b/>
+          <w:bCs/>
+          <w:sz w:val="24"/>
+          <w:szCs w:val="24"/>
+        </w:rPr>
+      </w:pPr>
+      <w:r>
+        <w:rPr>
+          <w:rFonts w:ascii="Calibri" w:hAnsi="Calibri" w:cs="Calibri"/>
+          <w:b/>
+          <w:bCs/>
+          <w:sz w:val="24"/>
+          <w:szCs w:val="24"/>
+        </w:rPr>
+        <w:t>Needs:</w:t>
+      </w:r>
+    </w:p>
+    <w:p>
+      <w:pPr>
+        <w:rPr>
+          <w:rFonts w:ascii="Calibri" w:hAnsi="Calibri" w:cs="Calibri"/>
+          <w:sz w:val="24"/>
+          <w:szCs w:val="24"/>
+        </w:rPr>
+      </w:pPr>
+      <w:r>
+        <w:rPr>
+          <w:rFonts w:ascii="Calibri" w:hAnsi="Calibri" w:cs="Calibri"/>
+          <w:sz w:val="24"/>
+          <w:szCs w:val="24"/>
+        </w:rPr>
+        <w:t>- Clear product listings with images and prices.</w:t>
+      </w:r>
+    </w:p>
+    <w:p>
+      <w:pPr>
+        <w:rPr>
+          <w:rFonts w:ascii="Calibri" w:hAnsi="Calibri" w:cs="Calibri"/>
+          <w:sz w:val="24"/>
+          <w:szCs w:val="24"/>
+        </w:rPr>
+      </w:pPr>
+      <w:r>
+        <w:rPr>
+          <w:rFonts w:ascii="Calibri" w:hAnsi="Calibri" w:cs="Calibri"/>
+          <w:sz w:val="24"/>
+          <w:szCs w:val="24"/>
+        </w:rPr>
+        <w:t>- Simple navigation through product categories.</w:t>
+      </w:r>
+    </w:p>
+    <w:p>
+      <w:pPr>
+        <w:rPr>
+          <w:rFonts w:ascii="Calibri" w:hAnsi="Calibri" w:cs="Calibri"/>
+          <w:sz w:val="24"/>
+          <w:szCs w:val="24"/>
+        </w:rPr>
+      </w:pPr>
+      <w:r>
+        <w:rPr>
+          <w:rFonts w:ascii="Calibri" w:hAnsi="Calibri" w:cs="Calibri"/>
+          <w:sz w:val="24"/>
+          <w:szCs w:val="24"/>
+        </w:rPr>
+        <w:t>- A fast and reliable checkout process.</w:t>
       </w:r>
     </w:p>
     <w:sectPr>

</xml_diff>

<commit_message>
Add customer persona behaviours and frustrations
</commit_message>
<xml_diff>
--- a/docs/Project-planning.docx
+++ b/docs/Project-planning.docx
@@ -778,6 +778,7 @@
           <w:bCs/>
           <w:sz w:val="24"/>
           <w:szCs w:val="24"/>
+          <w:lang w:val="ru-RU"/>
         </w:rPr>
       </w:pPr>
       <w:r>
@@ -799,15 +800,6 @@
           <w:szCs w:val="24"/>
         </w:rPr>
       </w:pPr>
-    </w:p>
-    <w:p>
-      <w:pPr>
-        <w:rPr>
-          <w:rFonts w:ascii="Calibri" w:hAnsi="Calibri" w:cs="Calibri"/>
-          <w:sz w:val="24"/>
-          <w:szCs w:val="24"/>
-        </w:rPr>
-      </w:pPr>
       <w:r>
         <w:rPr>
           <w:rFonts w:ascii="Calibri" w:hAnsi="Calibri" w:cs="Calibri"/>
@@ -840,6 +832,7 @@
           <w:rFonts w:ascii="Calibri" w:hAnsi="Calibri" w:cs="Calibri"/>
           <w:sz w:val="24"/>
           <w:szCs w:val="24"/>
+          <w:lang w:val="ru-RU"/>
         </w:rPr>
       </w:pPr>
       <w:r>
@@ -850,15 +843,6 @@
         </w:rPr>
         <w:t>Role: Supermarket Customer</w:t>
       </w:r>
-    </w:p>
-    <w:p>
-      <w:pPr>
-        <w:rPr>
-          <w:rFonts w:ascii="Calibri" w:hAnsi="Calibri" w:cs="Calibri"/>
-          <w:sz w:val="24"/>
-          <w:szCs w:val="24"/>
-        </w:rPr>
-      </w:pPr>
     </w:p>
     <w:p>
       <w:pPr>
@@ -895,52 +879,44 @@
           <w:sz w:val="24"/>
           <w:szCs w:val="24"/>
         </w:rPr>
+        <w:t>- Browse available supermarket products online.</w:t>
+      </w:r>
+    </w:p>
+    <w:p>
+      <w:pPr>
+        <w:rPr>
+          <w:rFonts w:ascii="Calibri" w:hAnsi="Calibri" w:cs="Calibri"/>
+          <w:sz w:val="24"/>
+          <w:szCs w:val="24"/>
+        </w:rPr>
+      </w:pPr>
+      <w:r>
+        <w:rPr>
+          <w:rFonts w:ascii="Calibri" w:hAnsi="Calibri" w:cs="Calibri"/>
+          <w:sz w:val="24"/>
+          <w:szCs w:val="24"/>
+        </w:rPr>
+        <w:t>- Check prices and product availability before visiting the store.</w:t>
+      </w:r>
+    </w:p>
+    <w:p>
+      <w:pPr>
+        <w:rPr>
+          <w:rFonts w:ascii="Calibri" w:hAnsi="Calibri" w:cs="Calibri"/>
+          <w:sz w:val="24"/>
+          <w:szCs w:val="24"/>
+          <w:lang w:val="ru-RU"/>
+        </w:rPr>
+      </w:pPr>
+      <w:r>
+        <w:rPr>
+          <w:rFonts w:ascii="Calibri" w:hAnsi="Calibri" w:cs="Calibri"/>
+          <w:sz w:val="24"/>
+          <w:szCs w:val="24"/>
+        </w:rPr>
         <w:lastRenderedPageBreak/>
-        <w:t>- Browse available supermarket products online.</w:t>
-      </w:r>
-    </w:p>
-    <w:p>
-      <w:pPr>
-        <w:rPr>
-          <w:rFonts w:ascii="Calibri" w:hAnsi="Calibri" w:cs="Calibri"/>
-          <w:sz w:val="24"/>
-          <w:szCs w:val="24"/>
-        </w:rPr>
-      </w:pPr>
-      <w:r>
-        <w:rPr>
-          <w:rFonts w:ascii="Calibri" w:hAnsi="Calibri" w:cs="Calibri"/>
-          <w:sz w:val="24"/>
-          <w:szCs w:val="24"/>
-        </w:rPr>
-        <w:t>- Check prices and product availability before visiting the store.</w:t>
-      </w:r>
-    </w:p>
-    <w:p>
-      <w:pPr>
-        <w:rPr>
-          <w:rFonts w:ascii="Calibri" w:hAnsi="Calibri" w:cs="Calibri"/>
-          <w:sz w:val="24"/>
-          <w:szCs w:val="24"/>
-        </w:rPr>
-      </w:pPr>
-      <w:r>
-        <w:rPr>
-          <w:rFonts w:ascii="Calibri" w:hAnsi="Calibri" w:cs="Calibri"/>
-          <w:sz w:val="24"/>
-          <w:szCs w:val="24"/>
-        </w:rPr>
         <w:t>- Quickly find products using search or categories.</w:t>
       </w:r>
-    </w:p>
-    <w:p>
-      <w:pPr>
-        <w:rPr>
-          <w:rFonts w:ascii="Calibri" w:hAnsi="Calibri" w:cs="Calibri"/>
-          <w:sz w:val="24"/>
-          <w:szCs w:val="24"/>
-        </w:rPr>
-      </w:pPr>
     </w:p>
     <w:p>
       <w:pPr>
@@ -1003,6 +979,7 @@
           <w:rFonts w:ascii="Calibri" w:hAnsi="Calibri" w:cs="Calibri"/>
           <w:sz w:val="24"/>
           <w:szCs w:val="24"/>
+          <w:lang w:val="ru-RU"/>
         </w:rPr>
       </w:pPr>
       <w:r>
@@ -1012,6 +989,151 @@
           <w:szCs w:val="24"/>
         </w:rPr>
         <w:t>- A fast and reliable checkout process.</w:t>
+      </w:r>
+    </w:p>
+    <w:p>
+      <w:pPr>
+        <w:rPr>
+          <w:rFonts w:ascii="Calibri" w:hAnsi="Calibri" w:cs="Calibri"/>
+          <w:b/>
+          <w:bCs/>
+          <w:sz w:val="24"/>
+          <w:szCs w:val="24"/>
+        </w:rPr>
+      </w:pPr>
+      <w:r>
+        <w:rPr>
+          <w:rFonts w:ascii="Calibri" w:hAnsi="Calibri" w:cs="Calibri"/>
+          <w:b/>
+          <w:bCs/>
+          <w:sz w:val="24"/>
+          <w:szCs w:val="24"/>
+        </w:rPr>
+        <w:t>Behaviours:</w:t>
+      </w:r>
+    </w:p>
+    <w:p>
+      <w:pPr>
+        <w:rPr>
+          <w:rFonts w:ascii="Calibri" w:hAnsi="Calibri" w:cs="Calibri"/>
+          <w:sz w:val="24"/>
+          <w:szCs w:val="24"/>
+        </w:rPr>
+      </w:pPr>
+      <w:r>
+        <w:rPr>
+          <w:rFonts w:ascii="Calibri" w:hAnsi="Calibri" w:cs="Calibri"/>
+          <w:sz w:val="24"/>
+          <w:szCs w:val="24"/>
+        </w:rPr>
+        <w:t>- Visits the website occasionally before shopping.</w:t>
+      </w:r>
+    </w:p>
+    <w:p>
+      <w:pPr>
+        <w:rPr>
+          <w:rFonts w:ascii="Calibri" w:hAnsi="Calibri" w:cs="Calibri"/>
+          <w:sz w:val="24"/>
+          <w:szCs w:val="24"/>
+        </w:rPr>
+      </w:pPr>
+      <w:r>
+        <w:rPr>
+          <w:rFonts w:ascii="Calibri" w:hAnsi="Calibri" w:cs="Calibri"/>
+          <w:sz w:val="24"/>
+          <w:szCs w:val="24"/>
+        </w:rPr>
+        <w:t>- Searches for specific products using filters or keywords.</w:t>
+      </w:r>
+    </w:p>
+    <w:p>
+      <w:pPr>
+        <w:rPr>
+          <w:rFonts w:ascii="Calibri" w:hAnsi="Calibri" w:cs="Calibri"/>
+          <w:sz w:val="24"/>
+          <w:szCs w:val="24"/>
+          <w:lang w:val="ru-RU"/>
+        </w:rPr>
+      </w:pPr>
+      <w:r>
+        <w:rPr>
+          <w:rFonts w:ascii="Calibri" w:hAnsi="Calibri" w:cs="Calibri"/>
+          <w:sz w:val="24"/>
+          <w:szCs w:val="24"/>
+        </w:rPr>
+        <w:t>- Adds items to the cart and places orders online.</w:t>
+      </w:r>
+    </w:p>
+    <w:p>
+      <w:pPr>
+        <w:rPr>
+          <w:rFonts w:ascii="Calibri" w:hAnsi="Calibri" w:cs="Calibri"/>
+          <w:b/>
+          <w:bCs/>
+          <w:sz w:val="24"/>
+          <w:szCs w:val="24"/>
+        </w:rPr>
+      </w:pPr>
+      <w:r>
+        <w:rPr>
+          <w:rFonts w:ascii="Calibri" w:hAnsi="Calibri" w:cs="Calibri"/>
+          <w:b/>
+          <w:bCs/>
+          <w:sz w:val="24"/>
+          <w:szCs w:val="24"/>
+        </w:rPr>
+        <w:t>Frustrations:</w:t>
+      </w:r>
+    </w:p>
+    <w:p>
+      <w:pPr>
+        <w:rPr>
+          <w:rFonts w:ascii="Calibri" w:hAnsi="Calibri" w:cs="Calibri"/>
+          <w:sz w:val="24"/>
+          <w:szCs w:val="24"/>
+        </w:rPr>
+      </w:pPr>
+      <w:r>
+        <w:rPr>
+          <w:rFonts w:ascii="Calibri" w:hAnsi="Calibri" w:cs="Calibri"/>
+          <w:sz w:val="24"/>
+          <w:szCs w:val="24"/>
+        </w:rPr>
+        <w:t>- Difficulty finding products in large supermarkets.</w:t>
+      </w:r>
+    </w:p>
+    <w:p>
+      <w:pPr>
+        <w:rPr>
+          <w:rFonts w:ascii="Calibri" w:hAnsi="Calibri" w:cs="Calibri"/>
+          <w:sz w:val="24"/>
+          <w:szCs w:val="24"/>
+        </w:rPr>
+      </w:pPr>
+      <w:r>
+        <w:rPr>
+          <w:rFonts w:ascii="Calibri" w:hAnsi="Calibri" w:cs="Calibri"/>
+          <w:sz w:val="24"/>
+          <w:szCs w:val="24"/>
+        </w:rPr>
+        <w:t>- Lack of clear price information.</w:t>
+      </w:r>
+    </w:p>
+    <w:p>
+      <w:pPr>
+        <w:rPr>
+          <w:rFonts w:ascii="Calibri" w:hAnsi="Calibri" w:cs="Calibri"/>
+          <w:sz w:val="24"/>
+          <w:szCs w:val="24"/>
+        </w:rPr>
+      </w:pPr>
+      <w:r>
+        <w:rPr>
+          <w:rFonts w:ascii="Calibri" w:hAnsi="Calibri" w:cs="Calibri"/>
+          <w:sz w:val="24"/>
+          <w:szCs w:val="24"/>
+        </w:rPr>
+        <w:t>- Limited ability to check product availability in advance.</w:t>
       </w:r>
     </w:p>
     <w:sectPr>

</xml_diff>

<commit_message>
Add store manager user flow
</commit_message>
<xml_diff>
--- a/docs/Project-planning.docx
+++ b/docs/Project-planning.docx
@@ -87,10 +87,11 @@
           <w:sz w:val="24"/>
           <w:szCs w:val="24"/>
         </w:rPr>
-        <w:t xml:space="preserve">Nikita </w:t>
-      </w:r>
-      <w:proofErr w:type="spellStart"/>
-      <w:r>
+        <w:t>Nikita Smiichyk</w:t>
+      </w:r>
+    </w:p>
+    <w:p>
+      <w:pPr>
         <w:rPr>
           <w:rFonts w:ascii="Calibri" w:hAnsi="Calibri" w:cs="Calibri"/>
           <w:i/>
@@ -98,12 +99,8 @@
           <w:sz w:val="24"/>
           <w:szCs w:val="24"/>
         </w:rPr>
-        <w:t>Smiichyk</w:t>
-      </w:r>
-      <w:proofErr w:type="spellEnd"/>
-    </w:p>
-    <w:p>
-      <w:pPr>
+      </w:pPr>
+      <w:r>
         <w:rPr>
           <w:rFonts w:ascii="Calibri" w:hAnsi="Calibri" w:cs="Calibri"/>
           <w:i/>
@@ -111,15 +108,6 @@
           <w:sz w:val="24"/>
           <w:szCs w:val="24"/>
         </w:rPr>
-      </w:pPr>
-      <w:r>
-        <w:rPr>
-          <w:rFonts w:ascii="Calibri" w:hAnsi="Calibri" w:cs="Calibri"/>
-          <w:i/>
-          <w:iCs/>
-          <w:sz w:val="24"/>
-          <w:szCs w:val="24"/>
-        </w:rPr>
         <w:t>Hanna Bokariuk</w:t>
       </w:r>
     </w:p>
@@ -468,25 +456,7 @@
           <w:sz w:val="24"/>
           <w:szCs w:val="24"/>
         </w:rPr>
-        <w:t xml:space="preserve">- Manage the supermarket product </w:t>
-      </w:r>
-      <w:proofErr w:type="spellStart"/>
-      <w:r>
-        <w:rPr>
-          <w:rFonts w:ascii="Calibri" w:hAnsi="Calibri" w:cs="Calibri"/>
-          <w:sz w:val="24"/>
-          <w:szCs w:val="24"/>
-        </w:rPr>
-        <w:t>catalog</w:t>
-      </w:r>
-      <w:proofErr w:type="spellEnd"/>
-      <w:r>
-        <w:rPr>
-          <w:rFonts w:ascii="Calibri" w:hAnsi="Calibri" w:cs="Calibri"/>
-          <w:sz w:val="24"/>
-          <w:szCs w:val="24"/>
-        </w:rPr>
-        <w:t xml:space="preserve"> efficiently.</w:t>
+        <w:t>- Manage the supermarket product catalog efficiently.</w:t>
       </w:r>
     </w:p>
     <w:p>
@@ -1125,6 +1095,7 @@
           <w:rFonts w:ascii="Calibri" w:hAnsi="Calibri" w:cs="Calibri"/>
           <w:sz w:val="24"/>
           <w:szCs w:val="24"/>
+          <w:lang w:val="ru-RU"/>
         </w:rPr>
       </w:pPr>
       <w:r>
@@ -1134,6 +1105,235 @@
           <w:szCs w:val="24"/>
         </w:rPr>
         <w:t>- Limited ability to check product availability in advance.</w:t>
+      </w:r>
+    </w:p>
+    <w:p>
+      <w:pPr>
+        <w:rPr>
+          <w:rFonts w:ascii="Calibri" w:hAnsi="Calibri" w:cs="Calibri"/>
+          <w:sz w:val="24"/>
+          <w:szCs w:val="24"/>
+          <w:lang w:val="ru-RU"/>
+        </w:rPr>
+      </w:pPr>
+    </w:p>
+    <w:p>
+      <w:pPr>
+        <w:rPr>
+          <w:rFonts w:ascii="Calibri" w:hAnsi="Calibri" w:cs="Calibri"/>
+          <w:b/>
+          <w:bCs/>
+          <w:sz w:val="24"/>
+          <w:szCs w:val="24"/>
+        </w:rPr>
+      </w:pPr>
+      <w:r>
+        <w:rPr>
+          <w:rFonts w:ascii="Calibri" w:hAnsi="Calibri" w:cs="Calibri"/>
+          <w:b/>
+          <w:bCs/>
+          <w:sz w:val="24"/>
+          <w:szCs w:val="24"/>
+        </w:rPr>
+        <w:t>3. User Flows / Task Journeys</w:t>
+      </w:r>
+    </w:p>
+    <w:p>
+      <w:pPr>
+        <w:rPr>
+          <w:rFonts w:ascii="Calibri" w:hAnsi="Calibri" w:cs="Calibri"/>
+          <w:sz w:val="24"/>
+          <w:szCs w:val="24"/>
+        </w:rPr>
+      </w:pPr>
+    </w:p>
+    <w:p>
+      <w:pPr>
+        <w:rPr>
+          <w:rFonts w:ascii="Calibri" w:hAnsi="Calibri" w:cs="Calibri"/>
+          <w:b/>
+          <w:bCs/>
+          <w:sz w:val="24"/>
+          <w:szCs w:val="24"/>
+        </w:rPr>
+      </w:pPr>
+      <w:r>
+        <w:rPr>
+          <w:rFonts w:ascii="Calibri" w:hAnsi="Calibri" w:cs="Calibri"/>
+          <w:b/>
+          <w:bCs/>
+          <w:sz w:val="24"/>
+          <w:szCs w:val="24"/>
+        </w:rPr>
+        <w:t>Store Manager Flow</w:t>
+      </w:r>
+    </w:p>
+    <w:p>
+      <w:pPr>
+        <w:rPr>
+          <w:rFonts w:ascii="Calibri" w:hAnsi="Calibri" w:cs="Calibri"/>
+          <w:color w:val="FF0000"/>
+          <w:sz w:val="24"/>
+          <w:szCs w:val="24"/>
+        </w:rPr>
+      </w:pPr>
+      <w:r>
+        <w:rPr>
+          <w:rFonts w:ascii="Calibri" w:hAnsi="Calibri" w:cs="Calibri"/>
+          <w:color w:val="FF0000"/>
+          <w:sz w:val="24"/>
+          <w:szCs w:val="24"/>
+        </w:rPr>
+        <w:t>I’ll add diagram later</w:t>
+      </w:r>
+    </w:p>
+    <w:p>
+      <w:pPr>
+        <w:rPr>
+          <w:rFonts w:ascii="Calibri" w:hAnsi="Calibri" w:cs="Calibri"/>
+          <w:sz w:val="24"/>
+          <w:szCs w:val="24"/>
+        </w:rPr>
+      </w:pPr>
+      <w:r>
+        <w:rPr>
+          <w:rFonts w:ascii="Calibri" w:hAnsi="Calibri" w:cs="Calibri"/>
+          <w:sz w:val="24"/>
+          <w:szCs w:val="24"/>
+        </w:rPr>
+        <w:t>Login → Access dashboard → View product list → Add new product → Submit form → Product saved → Edit or delete products if necessary.</w:t>
+      </w:r>
+    </w:p>
+    <w:p>
+      <w:pPr>
+        <w:rPr>
+          <w:rFonts w:ascii="Calibri" w:hAnsi="Calibri" w:cs="Calibri"/>
+          <w:sz w:val="24"/>
+          <w:szCs w:val="24"/>
+        </w:rPr>
+      </w:pPr>
+    </w:p>
+    <w:p>
+      <w:pPr>
+        <w:rPr>
+          <w:rFonts w:ascii="Calibri" w:hAnsi="Calibri" w:cs="Calibri"/>
+          <w:b/>
+          <w:bCs/>
+          <w:sz w:val="24"/>
+          <w:szCs w:val="24"/>
+        </w:rPr>
+      </w:pPr>
+      <w:r>
+        <w:rPr>
+          <w:rFonts w:ascii="Calibri" w:hAnsi="Calibri" w:cs="Calibri"/>
+          <w:b/>
+          <w:bCs/>
+          <w:sz w:val="24"/>
+          <w:szCs w:val="24"/>
+        </w:rPr>
+        <w:t>Steps:</w:t>
+      </w:r>
+    </w:p>
+    <w:p>
+      <w:pPr>
+        <w:rPr>
+          <w:rFonts w:ascii="Calibri" w:hAnsi="Calibri" w:cs="Calibri"/>
+          <w:sz w:val="24"/>
+          <w:szCs w:val="24"/>
+        </w:rPr>
+      </w:pPr>
+      <w:r>
+        <w:rPr>
+          <w:rFonts w:ascii="Calibri" w:hAnsi="Calibri" w:cs="Calibri"/>
+          <w:sz w:val="24"/>
+          <w:szCs w:val="24"/>
+        </w:rPr>
+        <w:t>1. The store manager logs into the system using their account credentials.</w:t>
+      </w:r>
+    </w:p>
+    <w:p>
+      <w:pPr>
+        <w:rPr>
+          <w:rFonts w:ascii="Calibri" w:hAnsi="Calibri" w:cs="Calibri"/>
+          <w:sz w:val="24"/>
+          <w:szCs w:val="24"/>
+        </w:rPr>
+      </w:pPr>
+      <w:r>
+        <w:rPr>
+          <w:rFonts w:ascii="Calibri" w:hAnsi="Calibri" w:cs="Calibri"/>
+          <w:sz w:val="24"/>
+          <w:szCs w:val="24"/>
+        </w:rPr>
+        <w:t>2. After authentication, the manager accesses the admin dashboard.</w:t>
+      </w:r>
+    </w:p>
+    <w:p>
+      <w:pPr>
+        <w:rPr>
+          <w:rFonts w:ascii="Calibri" w:hAnsi="Calibri" w:cs="Calibri"/>
+          <w:sz w:val="24"/>
+          <w:szCs w:val="24"/>
+        </w:rPr>
+      </w:pPr>
+      <w:r>
+        <w:rPr>
+          <w:rFonts w:ascii="Calibri" w:hAnsi="Calibri" w:cs="Calibri"/>
+          <w:sz w:val="24"/>
+          <w:szCs w:val="24"/>
+        </w:rPr>
+        <w:t>3. The manager views the list of existing products.</w:t>
+      </w:r>
+    </w:p>
+    <w:p>
+      <w:pPr>
+        <w:rPr>
+          <w:rFonts w:ascii="Calibri" w:hAnsi="Calibri" w:cs="Calibri"/>
+          <w:sz w:val="24"/>
+          <w:szCs w:val="24"/>
+        </w:rPr>
+      </w:pPr>
+      <w:r>
+        <w:rPr>
+          <w:rFonts w:ascii="Calibri" w:hAnsi="Calibri" w:cs="Calibri"/>
+          <w:sz w:val="24"/>
+          <w:szCs w:val="24"/>
+        </w:rPr>
+        <w:t>4. The manager can create a new product by filling in a product form.</w:t>
+      </w:r>
+    </w:p>
+    <w:p>
+      <w:pPr>
+        <w:rPr>
+          <w:rFonts w:ascii="Calibri" w:hAnsi="Calibri" w:cs="Calibri"/>
+          <w:sz w:val="24"/>
+          <w:szCs w:val="24"/>
+        </w:rPr>
+      </w:pPr>
+      <w:r>
+        <w:rPr>
+          <w:rFonts w:ascii="Calibri" w:hAnsi="Calibri" w:cs="Calibri"/>
+          <w:sz w:val="24"/>
+          <w:szCs w:val="24"/>
+        </w:rPr>
+        <w:t>5. The product is saved to the database after validation.</w:t>
+      </w:r>
+    </w:p>
+    <w:p>
+      <w:pPr>
+        <w:rPr>
+          <w:rFonts w:ascii="Calibri" w:hAnsi="Calibri" w:cs="Calibri"/>
+          <w:sz w:val="24"/>
+          <w:szCs w:val="24"/>
+        </w:rPr>
+      </w:pPr>
+      <w:r>
+        <w:rPr>
+          <w:rFonts w:ascii="Calibri" w:hAnsi="Calibri" w:cs="Calibri"/>
+          <w:sz w:val="24"/>
+          <w:szCs w:val="24"/>
+        </w:rPr>
+        <w:t>6. The manager can later edit product details or remove products when they are no longer available.</w:t>
       </w:r>
     </w:p>
     <w:sectPr>

</xml_diff>

<commit_message>
Add customer user flow
</commit_message>
<xml_diff>
--- a/docs/Project-planning.docx
+++ b/docs/Project-planning.docx
@@ -87,11 +87,10 @@
           <w:sz w:val="24"/>
           <w:szCs w:val="24"/>
         </w:rPr>
-        <w:t>Nikita Smiichyk</w:t>
-      </w:r>
-    </w:p>
-    <w:p>
-      <w:pPr>
+        <w:t xml:space="preserve">Nikita </w:t>
+      </w:r>
+      <w:proofErr w:type="spellStart"/>
+      <w:r>
         <w:rPr>
           <w:rFonts w:ascii="Calibri" w:hAnsi="Calibri" w:cs="Calibri"/>
           <w:i/>
@@ -99,8 +98,12 @@
           <w:sz w:val="24"/>
           <w:szCs w:val="24"/>
         </w:rPr>
-      </w:pPr>
-      <w:r>
+        <w:t>Smiichyk</w:t>
+      </w:r>
+      <w:proofErr w:type="spellEnd"/>
+    </w:p>
+    <w:p>
+      <w:pPr>
         <w:rPr>
           <w:rFonts w:ascii="Calibri" w:hAnsi="Calibri" w:cs="Calibri"/>
           <w:i/>
@@ -108,6 +111,15 @@
           <w:sz w:val="24"/>
           <w:szCs w:val="24"/>
         </w:rPr>
+      </w:pPr>
+      <w:r>
+        <w:rPr>
+          <w:rFonts w:ascii="Calibri" w:hAnsi="Calibri" w:cs="Calibri"/>
+          <w:i/>
+          <w:iCs/>
+          <w:sz w:val="24"/>
+          <w:szCs w:val="24"/>
+        </w:rPr>
         <w:t>Hanna Bokariuk</w:t>
       </w:r>
     </w:p>
@@ -339,6 +351,7 @@
           <w:bCs/>
           <w:sz w:val="24"/>
           <w:szCs w:val="24"/>
+          <w:lang w:val="ru-RU"/>
         </w:rPr>
       </w:pPr>
       <w:r>
@@ -356,6 +369,35 @@
       <w:pPr>
         <w:rPr>
           <w:rFonts w:ascii="Calibri" w:hAnsi="Calibri" w:cs="Calibri"/>
+          <w:color w:val="FF0000"/>
+          <w:sz w:val="24"/>
+          <w:szCs w:val="24"/>
+        </w:rPr>
+      </w:pPr>
+      <w:r>
+        <w:rPr>
+          <w:rFonts w:ascii="Calibri" w:hAnsi="Calibri" w:cs="Calibri"/>
+          <w:color w:val="FF0000"/>
+          <w:sz w:val="24"/>
+          <w:szCs w:val="24"/>
+        </w:rPr>
+        <w:lastRenderedPageBreak/>
+        <w:t>p</w:t>
+      </w:r>
+      <w:r>
+        <w:rPr>
+          <w:rFonts w:ascii="Calibri" w:hAnsi="Calibri" w:cs="Calibri"/>
+          <w:color w:val="FF0000"/>
+          <w:sz w:val="24"/>
+          <w:szCs w:val="24"/>
+        </w:rPr>
+        <w:t>hoto</w:t>
+      </w:r>
+    </w:p>
+    <w:p>
+      <w:pPr>
+        <w:rPr>
+          <w:rFonts w:ascii="Calibri" w:hAnsi="Calibri" w:cs="Calibri"/>
           <w:sz w:val="24"/>
           <w:szCs w:val="24"/>
         </w:rPr>
@@ -456,7 +498,25 @@
           <w:sz w:val="24"/>
           <w:szCs w:val="24"/>
         </w:rPr>
-        <w:t>- Manage the supermarket product catalog efficiently.</w:t>
+        <w:t xml:space="preserve">- Manage the supermarket product </w:t>
+      </w:r>
+      <w:proofErr w:type="spellStart"/>
+      <w:r>
+        <w:rPr>
+          <w:rFonts w:ascii="Calibri" w:hAnsi="Calibri" w:cs="Calibri"/>
+          <w:sz w:val="24"/>
+          <w:szCs w:val="24"/>
+        </w:rPr>
+        <w:t>catalog</w:t>
+      </w:r>
+      <w:proofErr w:type="spellEnd"/>
+      <w:r>
+        <w:rPr>
+          <w:rFonts w:ascii="Calibri" w:hAnsi="Calibri" w:cs="Calibri"/>
+          <w:sz w:val="24"/>
+          <w:szCs w:val="24"/>
+        </w:rPr>
+        <w:t xml:space="preserve"> efficiently.</w:t>
       </w:r>
     </w:p>
     <w:p>
@@ -748,7 +808,6 @@
           <w:bCs/>
           <w:sz w:val="24"/>
           <w:szCs w:val="24"/>
-          <w:lang w:val="ru-RU"/>
         </w:rPr>
       </w:pPr>
       <w:r>
@@ -766,6 +825,34 @@
       <w:pPr>
         <w:rPr>
           <w:rFonts w:ascii="Calibri" w:hAnsi="Calibri" w:cs="Calibri"/>
+          <w:color w:val="FF0000"/>
+          <w:sz w:val="24"/>
+          <w:szCs w:val="24"/>
+        </w:rPr>
+      </w:pPr>
+      <w:r>
+        <w:rPr>
+          <w:rFonts w:ascii="Calibri" w:hAnsi="Calibri" w:cs="Calibri"/>
+          <w:color w:val="FF0000"/>
+          <w:sz w:val="24"/>
+          <w:szCs w:val="24"/>
+        </w:rPr>
+        <w:t>p</w:t>
+      </w:r>
+      <w:r>
+        <w:rPr>
+          <w:rFonts w:ascii="Calibri" w:hAnsi="Calibri" w:cs="Calibri"/>
+          <w:color w:val="FF0000"/>
+          <w:sz w:val="24"/>
+          <w:szCs w:val="24"/>
+        </w:rPr>
+        <w:t>hoto</w:t>
+      </w:r>
+    </w:p>
+    <w:p>
+      <w:pPr>
+        <w:rPr>
+          <w:rFonts w:ascii="Calibri" w:hAnsi="Calibri" w:cs="Calibri"/>
           <w:sz w:val="24"/>
           <w:szCs w:val="24"/>
         </w:rPr>
@@ -849,6 +936,7 @@
           <w:sz w:val="24"/>
           <w:szCs w:val="24"/>
         </w:rPr>
+        <w:lastRenderedPageBreak/>
         <w:t>- Browse available supermarket products online.</w:t>
       </w:r>
     </w:p>
@@ -884,7 +972,6 @@
           <w:sz w:val="24"/>
           <w:szCs w:val="24"/>
         </w:rPr>
-        <w:lastRenderedPageBreak/>
         <w:t>- Quickly find products using search or categories.</w:t>
       </w:r>
     </w:p>
@@ -1221,6 +1308,7 @@
           <w:bCs/>
           <w:sz w:val="24"/>
           <w:szCs w:val="24"/>
+          <w:lang w:val="ru-RU"/>
         </w:rPr>
       </w:pPr>
       <w:r>
@@ -1325,15 +1413,244 @@
           <w:rFonts w:ascii="Calibri" w:hAnsi="Calibri" w:cs="Calibri"/>
           <w:sz w:val="24"/>
           <w:szCs w:val="24"/>
-        </w:rPr>
-      </w:pPr>
-      <w:r>
-        <w:rPr>
-          <w:rFonts w:ascii="Calibri" w:hAnsi="Calibri" w:cs="Calibri"/>
-          <w:sz w:val="24"/>
-          <w:szCs w:val="24"/>
-        </w:rPr>
+          <w:lang w:val="ru-RU"/>
+        </w:rPr>
+      </w:pPr>
+      <w:r>
+        <w:rPr>
+          <w:rFonts w:ascii="Calibri" w:hAnsi="Calibri" w:cs="Calibri"/>
+          <w:sz w:val="24"/>
+          <w:szCs w:val="24"/>
+        </w:rPr>
+        <w:lastRenderedPageBreak/>
         <w:t>6. The manager can later edit product details or remove products when they are no longer available.</w:t>
+      </w:r>
+    </w:p>
+    <w:p>
+      <w:pPr>
+        <w:rPr>
+          <w:rFonts w:ascii="Calibri" w:hAnsi="Calibri" w:cs="Calibri"/>
+          <w:sz w:val="24"/>
+          <w:szCs w:val="24"/>
+        </w:rPr>
+      </w:pPr>
+      <w:r>
+        <w:rPr>
+          <w:rFonts w:ascii="Calibri" w:hAnsi="Calibri" w:cs="Calibri"/>
+          <w:sz w:val="24"/>
+          <w:szCs w:val="24"/>
+        </w:rPr>
+        <w:t>Customer Flow</w:t>
+      </w:r>
+    </w:p>
+    <w:p>
+      <w:pPr>
+        <w:rPr>
+          <w:rFonts w:ascii="Calibri" w:hAnsi="Calibri" w:cs="Calibri"/>
+          <w:sz w:val="24"/>
+          <w:szCs w:val="24"/>
+        </w:rPr>
+      </w:pPr>
+    </w:p>
+    <w:p>
+      <w:pPr>
+        <w:rPr>
+          <w:rFonts w:ascii="Calibri" w:hAnsi="Calibri" w:cs="Calibri"/>
+          <w:sz w:val="24"/>
+          <w:szCs w:val="24"/>
+        </w:rPr>
+      </w:pPr>
+      <w:r>
+        <w:rPr>
+          <w:rFonts w:ascii="Calibri" w:hAnsi="Calibri" w:cs="Calibri"/>
+          <w:sz w:val="24"/>
+          <w:szCs w:val="24"/>
+        </w:rPr>
+        <w:t xml:space="preserve">Visit homepage → Browse product </w:t>
+      </w:r>
+      <w:proofErr w:type="spellStart"/>
+      <w:r>
+        <w:rPr>
+          <w:rFonts w:ascii="Calibri" w:hAnsi="Calibri" w:cs="Calibri"/>
+          <w:sz w:val="24"/>
+          <w:szCs w:val="24"/>
+        </w:rPr>
+        <w:t>catalog</w:t>
+      </w:r>
+      <w:proofErr w:type="spellEnd"/>
+      <w:r>
+        <w:rPr>
+          <w:rFonts w:ascii="Calibri" w:hAnsi="Calibri" w:cs="Calibri"/>
+          <w:sz w:val="24"/>
+          <w:szCs w:val="24"/>
+        </w:rPr>
+        <w:t xml:space="preserve"> → Select product → View product details → Add item to cart → Proceed to checkout → Confirm order.</w:t>
+      </w:r>
+    </w:p>
+    <w:p>
+      <w:pPr>
+        <w:rPr>
+          <w:rFonts w:ascii="Calibri" w:hAnsi="Calibri" w:cs="Calibri"/>
+          <w:color w:val="FF0000"/>
+          <w:sz w:val="24"/>
+          <w:szCs w:val="24"/>
+        </w:rPr>
+      </w:pPr>
+      <w:r>
+        <w:rPr>
+          <w:rFonts w:ascii="Calibri" w:hAnsi="Calibri" w:cs="Calibri"/>
+          <w:color w:val="FF0000"/>
+          <w:sz w:val="24"/>
+          <w:szCs w:val="24"/>
+        </w:rPr>
+        <w:t>I’ll add diagram later</w:t>
+      </w:r>
+    </w:p>
+    <w:p>
+      <w:pPr>
+        <w:rPr>
+          <w:rFonts w:ascii="Calibri" w:hAnsi="Calibri" w:cs="Calibri"/>
+          <w:sz w:val="24"/>
+          <w:szCs w:val="24"/>
+        </w:rPr>
+      </w:pPr>
+    </w:p>
+    <w:p>
+      <w:pPr>
+        <w:rPr>
+          <w:rFonts w:ascii="Calibri" w:hAnsi="Calibri" w:cs="Calibri"/>
+          <w:sz w:val="24"/>
+          <w:szCs w:val="24"/>
+          <w:lang w:val="ru-RU"/>
+        </w:rPr>
+      </w:pPr>
+      <w:r>
+        <w:rPr>
+          <w:rFonts w:ascii="Calibri" w:hAnsi="Calibri" w:cs="Calibri"/>
+          <w:sz w:val="24"/>
+          <w:szCs w:val="24"/>
+        </w:rPr>
+        <w:t>Steps:</w:t>
+      </w:r>
+    </w:p>
+    <w:p>
+      <w:pPr>
+        <w:rPr>
+          <w:rFonts w:ascii="Calibri" w:hAnsi="Calibri" w:cs="Calibri"/>
+          <w:sz w:val="24"/>
+          <w:szCs w:val="24"/>
+        </w:rPr>
+      </w:pPr>
+      <w:r>
+        <w:rPr>
+          <w:rFonts w:ascii="Calibri" w:hAnsi="Calibri" w:cs="Calibri"/>
+          <w:sz w:val="24"/>
+          <w:szCs w:val="24"/>
+        </w:rPr>
+        <w:t>1. The customer visits the website homepage.</w:t>
+      </w:r>
+    </w:p>
+    <w:p>
+      <w:pPr>
+        <w:rPr>
+          <w:rFonts w:ascii="Calibri" w:hAnsi="Calibri" w:cs="Calibri"/>
+          <w:sz w:val="24"/>
+          <w:szCs w:val="24"/>
+        </w:rPr>
+      </w:pPr>
+      <w:r>
+        <w:rPr>
+          <w:rFonts w:ascii="Calibri" w:hAnsi="Calibri" w:cs="Calibri"/>
+          <w:sz w:val="24"/>
+          <w:szCs w:val="24"/>
+        </w:rPr>
+        <w:t xml:space="preserve">2. The customer browses the product </w:t>
+      </w:r>
+      <w:proofErr w:type="spellStart"/>
+      <w:r>
+        <w:rPr>
+          <w:rFonts w:ascii="Calibri" w:hAnsi="Calibri" w:cs="Calibri"/>
+          <w:sz w:val="24"/>
+          <w:szCs w:val="24"/>
+        </w:rPr>
+        <w:t>catalog</w:t>
+      </w:r>
+      <w:proofErr w:type="spellEnd"/>
+      <w:r>
+        <w:rPr>
+          <w:rFonts w:ascii="Calibri" w:hAnsi="Calibri" w:cs="Calibri"/>
+          <w:sz w:val="24"/>
+          <w:szCs w:val="24"/>
+        </w:rPr>
+        <w:t xml:space="preserve"> or searches for specific products.</w:t>
+      </w:r>
+    </w:p>
+    <w:p>
+      <w:pPr>
+        <w:rPr>
+          <w:rFonts w:ascii="Calibri" w:hAnsi="Calibri" w:cs="Calibri"/>
+          <w:sz w:val="24"/>
+          <w:szCs w:val="24"/>
+        </w:rPr>
+      </w:pPr>
+      <w:r>
+        <w:rPr>
+          <w:rFonts w:ascii="Calibri" w:hAnsi="Calibri" w:cs="Calibri"/>
+          <w:sz w:val="24"/>
+          <w:szCs w:val="24"/>
+        </w:rPr>
+        <w:t>3. The customer selects a product to view detailed information.</w:t>
+      </w:r>
+    </w:p>
+    <w:p>
+      <w:pPr>
+        <w:rPr>
+          <w:rFonts w:ascii="Calibri" w:hAnsi="Calibri" w:cs="Calibri"/>
+          <w:sz w:val="24"/>
+          <w:szCs w:val="24"/>
+        </w:rPr>
+      </w:pPr>
+      <w:r>
+        <w:rPr>
+          <w:rFonts w:ascii="Calibri" w:hAnsi="Calibri" w:cs="Calibri"/>
+          <w:sz w:val="24"/>
+          <w:szCs w:val="24"/>
+        </w:rPr>
+        <w:t>4. The customer adds the selected product to the shopping cart.</w:t>
+      </w:r>
+    </w:p>
+    <w:p>
+      <w:pPr>
+        <w:rPr>
+          <w:rFonts w:ascii="Calibri" w:hAnsi="Calibri" w:cs="Calibri"/>
+          <w:sz w:val="24"/>
+          <w:szCs w:val="24"/>
+        </w:rPr>
+      </w:pPr>
+      <w:r>
+        <w:rPr>
+          <w:rFonts w:ascii="Calibri" w:hAnsi="Calibri" w:cs="Calibri"/>
+          <w:sz w:val="24"/>
+          <w:szCs w:val="24"/>
+        </w:rPr>
+        <w:t>5. The customer proceeds to the checkout page.</w:t>
+      </w:r>
+    </w:p>
+    <w:p>
+      <w:pPr>
+        <w:rPr>
+          <w:rFonts w:ascii="Calibri" w:hAnsi="Calibri" w:cs="Calibri"/>
+          <w:sz w:val="24"/>
+          <w:szCs w:val="24"/>
+        </w:rPr>
+      </w:pPr>
+      <w:r>
+        <w:rPr>
+          <w:rFonts w:ascii="Calibri" w:hAnsi="Calibri" w:cs="Calibri"/>
+          <w:sz w:val="24"/>
+          <w:szCs w:val="24"/>
+        </w:rPr>
+        <w:t>6. The system creates an order record and confirms the order.</w:t>
       </w:r>
     </w:p>
     <w:sectPr>

</xml_diff>